<commit_message>
1 Actualizacíon 15 abril laddy
</commit_message>
<xml_diff>
--- a/ruta/EXXO.docx
+++ b/ruta/EXXO.docx
@@ -198,6 +198,603 @@
     </w:tbl>
     <w:p/>
     <w:p/>
+    <w:p>
+      <w:r>
+        <w:drawing>
+          <wp:inline distT="0" distR="0" distB="0" distL="0">
+            <wp:extent cx="1701800" cy="3175000"/>
+            <wp:docPr id="0" name="Drawing 0" descr="captura_pantalla_15_04_2026_12_01_57.jpg"/>
+            <a:graphic xmlns:a="http://schemas.openxmlformats.org/drawingml/2006/main">
+              <a:graphicData uri="http://schemas.openxmlformats.org/drawingml/2006/picture">
+                <pic:pic xmlns:pic="http://schemas.openxmlformats.org/drawingml/2006/picture">
+                  <pic:nvPicPr>
+                    <pic:cNvPr id="0" name="Picture 0" descr="captura_pantalla_15_04_2026_12_01_57.jpg"/>
+                    <pic:cNvPicPr>
+                      <a:picLocks noChangeAspect="true"/>
+                    </pic:cNvPicPr>
+                  </pic:nvPicPr>
+                  <pic:blipFill>
+                    <a:blip r:embed="rId11"/>
+                    <a:stretch>
+                      <a:fillRect/>
+                    </a:stretch>
+                  </pic:blipFill>
+                  <pic:spPr>
+                    <a:xfrm>
+                      <a:off x="0" y="0"/>
+                      <a:ext cx="1701800" cy="3175000"/>
+                    </a:xfrm>
+                    <a:prstGeom prst="rect">
+                      <a:avLst/>
+                    </a:prstGeom>
+                  </pic:spPr>
+                </pic:pic>
+              </a:graphicData>
+            </a:graphic>
+          </wp:inline>
+        </w:drawing>
+      </w:r>
+      <w:r>
+        <w:drawing>
+          <wp:inline distT="0" distR="0" distB="0" distL="0">
+            <wp:extent cx="1701800" cy="3175000"/>
+            <wp:docPr id="1" name="Drawing 1" descr="captura_pantalla_15_04_2026_12_02_26.jpg"/>
+            <a:graphic xmlns:a="http://schemas.openxmlformats.org/drawingml/2006/main">
+              <a:graphicData uri="http://schemas.openxmlformats.org/drawingml/2006/picture">
+                <pic:pic xmlns:pic="http://schemas.openxmlformats.org/drawingml/2006/picture">
+                  <pic:nvPicPr>
+                    <pic:cNvPr id="0" name="Picture 1" descr="captura_pantalla_15_04_2026_12_02_26.jpg"/>
+                    <pic:cNvPicPr>
+                      <a:picLocks noChangeAspect="true"/>
+                    </pic:cNvPicPr>
+                  </pic:nvPicPr>
+                  <pic:blipFill>
+                    <a:blip r:embed="rId12"/>
+                    <a:stretch>
+                      <a:fillRect/>
+                    </a:stretch>
+                  </pic:blipFill>
+                  <pic:spPr>
+                    <a:xfrm>
+                      <a:off x="0" y="0"/>
+                      <a:ext cx="1701800" cy="3175000"/>
+                    </a:xfrm>
+                    <a:prstGeom prst="rect">
+                      <a:avLst/>
+                    </a:prstGeom>
+                  </pic:spPr>
+                </pic:pic>
+              </a:graphicData>
+            </a:graphic>
+          </wp:inline>
+        </w:drawing>
+      </w:r>
+      <w:r>
+        <w:drawing>
+          <wp:inline distT="0" distR="0" distB="0" distL="0">
+            <wp:extent cx="1701800" cy="3175000"/>
+            <wp:docPr id="2" name="Drawing 2" descr="captura_pantalla_15_04_2026_12_02_29.jpg"/>
+            <a:graphic xmlns:a="http://schemas.openxmlformats.org/drawingml/2006/main">
+              <a:graphicData uri="http://schemas.openxmlformats.org/drawingml/2006/picture">
+                <pic:pic xmlns:pic="http://schemas.openxmlformats.org/drawingml/2006/picture">
+                  <pic:nvPicPr>
+                    <pic:cNvPr id="0" name="Picture 2" descr="captura_pantalla_15_04_2026_12_02_29.jpg"/>
+                    <pic:cNvPicPr>
+                      <a:picLocks noChangeAspect="true"/>
+                    </pic:cNvPicPr>
+                  </pic:nvPicPr>
+                  <pic:blipFill>
+                    <a:blip r:embed="rId13"/>
+                    <a:stretch>
+                      <a:fillRect/>
+                    </a:stretch>
+                  </pic:blipFill>
+                  <pic:spPr>
+                    <a:xfrm>
+                      <a:off x="0" y="0"/>
+                      <a:ext cx="1701800" cy="3175000"/>
+                    </a:xfrm>
+                    <a:prstGeom prst="rect">
+                      <a:avLst/>
+                    </a:prstGeom>
+                  </pic:spPr>
+                </pic:pic>
+              </a:graphicData>
+            </a:graphic>
+          </wp:inline>
+        </w:drawing>
+      </w:r>
+      <w:r>
+        <w:drawing>
+          <wp:inline distT="0" distR="0" distB="0" distL="0">
+            <wp:extent cx="1701800" cy="3175000"/>
+            <wp:docPr id="3" name="Drawing 3" descr="captura_pantalla_15_04_2026_12_02_53.jpg"/>
+            <a:graphic xmlns:a="http://schemas.openxmlformats.org/drawingml/2006/main">
+              <a:graphicData uri="http://schemas.openxmlformats.org/drawingml/2006/picture">
+                <pic:pic xmlns:pic="http://schemas.openxmlformats.org/drawingml/2006/picture">
+                  <pic:nvPicPr>
+                    <pic:cNvPr id="0" name="Picture 3" descr="captura_pantalla_15_04_2026_12_02_53.jpg"/>
+                    <pic:cNvPicPr>
+                      <a:picLocks noChangeAspect="true"/>
+                    </pic:cNvPicPr>
+                  </pic:nvPicPr>
+                  <pic:blipFill>
+                    <a:blip r:embed="rId14"/>
+                    <a:stretch>
+                      <a:fillRect/>
+                    </a:stretch>
+                  </pic:blipFill>
+                  <pic:spPr>
+                    <a:xfrm>
+                      <a:off x="0" y="0"/>
+                      <a:ext cx="1701800" cy="3175000"/>
+                    </a:xfrm>
+                    <a:prstGeom prst="rect">
+                      <a:avLst/>
+                    </a:prstGeom>
+                  </pic:spPr>
+                </pic:pic>
+              </a:graphicData>
+            </a:graphic>
+          </wp:inline>
+        </w:drawing>
+      </w:r>
+      <w:r>
+        <w:drawing>
+          <wp:inline distT="0" distR="0" distB="0" distL="0">
+            <wp:extent cx="1701800" cy="3175000"/>
+            <wp:docPr id="4" name="Drawing 4" descr="captura_pantalla_15_04_2026_12_03_12.jpg"/>
+            <a:graphic xmlns:a="http://schemas.openxmlformats.org/drawingml/2006/main">
+              <a:graphicData uri="http://schemas.openxmlformats.org/drawingml/2006/picture">
+                <pic:pic xmlns:pic="http://schemas.openxmlformats.org/drawingml/2006/picture">
+                  <pic:nvPicPr>
+                    <pic:cNvPr id="0" name="Picture 4" descr="captura_pantalla_15_04_2026_12_03_12.jpg"/>
+                    <pic:cNvPicPr>
+                      <a:picLocks noChangeAspect="true"/>
+                    </pic:cNvPicPr>
+                  </pic:nvPicPr>
+                  <pic:blipFill>
+                    <a:blip r:embed="rId15"/>
+                    <a:stretch>
+                      <a:fillRect/>
+                    </a:stretch>
+                  </pic:blipFill>
+                  <pic:spPr>
+                    <a:xfrm>
+                      <a:off x="0" y="0"/>
+                      <a:ext cx="1701800" cy="3175000"/>
+                    </a:xfrm>
+                    <a:prstGeom prst="rect">
+                      <a:avLst/>
+                    </a:prstGeom>
+                  </pic:spPr>
+                </pic:pic>
+              </a:graphicData>
+            </a:graphic>
+          </wp:inline>
+        </w:drawing>
+      </w:r>
+      <w:r>
+        <w:drawing>
+          <wp:inline distT="0" distR="0" distB="0" distL="0">
+            <wp:extent cx="1701800" cy="3175000"/>
+            <wp:docPr id="5" name="Drawing 5" descr="captura_pantalla_15_04_2026_12_03_38.jpg"/>
+            <a:graphic xmlns:a="http://schemas.openxmlformats.org/drawingml/2006/main">
+              <a:graphicData uri="http://schemas.openxmlformats.org/drawingml/2006/picture">
+                <pic:pic xmlns:pic="http://schemas.openxmlformats.org/drawingml/2006/picture">
+                  <pic:nvPicPr>
+                    <pic:cNvPr id="0" name="Picture 5" descr="captura_pantalla_15_04_2026_12_03_38.jpg"/>
+                    <pic:cNvPicPr>
+                      <a:picLocks noChangeAspect="true"/>
+                    </pic:cNvPicPr>
+                  </pic:nvPicPr>
+                  <pic:blipFill>
+                    <a:blip r:embed="rId16"/>
+                    <a:stretch>
+                      <a:fillRect/>
+                    </a:stretch>
+                  </pic:blipFill>
+                  <pic:spPr>
+                    <a:xfrm>
+                      <a:off x="0" y="0"/>
+                      <a:ext cx="1701800" cy="3175000"/>
+                    </a:xfrm>
+                    <a:prstGeom prst="rect">
+                      <a:avLst/>
+                    </a:prstGeom>
+                  </pic:spPr>
+                </pic:pic>
+              </a:graphicData>
+            </a:graphic>
+          </wp:inline>
+        </w:drawing>
+      </w:r>
+      <w:r>
+        <w:drawing>
+          <wp:inline distT="0" distR="0" distB="0" distL="0">
+            <wp:extent cx="1701800" cy="3175000"/>
+            <wp:docPr id="6" name="Drawing 6" descr="captura_pantalla_15_04_2026_12_03_55.jpg"/>
+            <a:graphic xmlns:a="http://schemas.openxmlformats.org/drawingml/2006/main">
+              <a:graphicData uri="http://schemas.openxmlformats.org/drawingml/2006/picture">
+                <pic:pic xmlns:pic="http://schemas.openxmlformats.org/drawingml/2006/picture">
+                  <pic:nvPicPr>
+                    <pic:cNvPr id="0" name="Picture 6" descr="captura_pantalla_15_04_2026_12_03_55.jpg"/>
+                    <pic:cNvPicPr>
+                      <a:picLocks noChangeAspect="true"/>
+                    </pic:cNvPicPr>
+                  </pic:nvPicPr>
+                  <pic:blipFill>
+                    <a:blip r:embed="rId17"/>
+                    <a:stretch>
+                      <a:fillRect/>
+                    </a:stretch>
+                  </pic:blipFill>
+                  <pic:spPr>
+                    <a:xfrm>
+                      <a:off x="0" y="0"/>
+                      <a:ext cx="1701800" cy="3175000"/>
+                    </a:xfrm>
+                    <a:prstGeom prst="rect">
+                      <a:avLst/>
+                    </a:prstGeom>
+                  </pic:spPr>
+                </pic:pic>
+              </a:graphicData>
+            </a:graphic>
+          </wp:inline>
+        </w:drawing>
+      </w:r>
+      <w:r>
+        <w:drawing>
+          <wp:inline distT="0" distR="0" distB="0" distL="0">
+            <wp:extent cx="1701800" cy="3175000"/>
+            <wp:docPr id="7" name="Drawing 7" descr="captura_pantalla_15_04_2026_12_04_19.jpg"/>
+            <a:graphic xmlns:a="http://schemas.openxmlformats.org/drawingml/2006/main">
+              <a:graphicData uri="http://schemas.openxmlformats.org/drawingml/2006/picture">
+                <pic:pic xmlns:pic="http://schemas.openxmlformats.org/drawingml/2006/picture">
+                  <pic:nvPicPr>
+                    <pic:cNvPr id="0" name="Picture 7" descr="captura_pantalla_15_04_2026_12_04_19.jpg"/>
+                    <pic:cNvPicPr>
+                      <a:picLocks noChangeAspect="true"/>
+                    </pic:cNvPicPr>
+                  </pic:nvPicPr>
+                  <pic:blipFill>
+                    <a:blip r:embed="rId18"/>
+                    <a:stretch>
+                      <a:fillRect/>
+                    </a:stretch>
+                  </pic:blipFill>
+                  <pic:spPr>
+                    <a:xfrm>
+                      <a:off x="0" y="0"/>
+                      <a:ext cx="1701800" cy="3175000"/>
+                    </a:xfrm>
+                    <a:prstGeom prst="rect">
+                      <a:avLst/>
+                    </a:prstGeom>
+                  </pic:spPr>
+                </pic:pic>
+              </a:graphicData>
+            </a:graphic>
+          </wp:inline>
+        </w:drawing>
+      </w:r>
+      <w:r>
+        <w:drawing>
+          <wp:inline distT="0" distR="0" distB="0" distL="0">
+            <wp:extent cx="1701800" cy="3175000"/>
+            <wp:docPr id="8" name="Drawing 8" descr="captura_pantalla_15_04_2026_12_04_24.jpg"/>
+            <a:graphic xmlns:a="http://schemas.openxmlformats.org/drawingml/2006/main">
+              <a:graphicData uri="http://schemas.openxmlformats.org/drawingml/2006/picture">
+                <pic:pic xmlns:pic="http://schemas.openxmlformats.org/drawingml/2006/picture">
+                  <pic:nvPicPr>
+                    <pic:cNvPr id="0" name="Picture 8" descr="captura_pantalla_15_04_2026_12_04_24.jpg"/>
+                    <pic:cNvPicPr>
+                      <a:picLocks noChangeAspect="true"/>
+                    </pic:cNvPicPr>
+                  </pic:nvPicPr>
+                  <pic:blipFill>
+                    <a:blip r:embed="rId19"/>
+                    <a:stretch>
+                      <a:fillRect/>
+                    </a:stretch>
+                  </pic:blipFill>
+                  <pic:spPr>
+                    <a:xfrm>
+                      <a:off x="0" y="0"/>
+                      <a:ext cx="1701800" cy="3175000"/>
+                    </a:xfrm>
+                    <a:prstGeom prst="rect">
+                      <a:avLst/>
+                    </a:prstGeom>
+                  </pic:spPr>
+                </pic:pic>
+              </a:graphicData>
+            </a:graphic>
+          </wp:inline>
+        </w:drawing>
+      </w:r>
+      <w:r>
+        <w:drawing>
+          <wp:inline distT="0" distR="0" distB="0" distL="0">
+            <wp:extent cx="1701800" cy="3175000"/>
+            <wp:docPr id="9" name="Drawing 9" descr="captura_pantalla_15_04_2026_12_04_44.jpg"/>
+            <a:graphic xmlns:a="http://schemas.openxmlformats.org/drawingml/2006/main">
+              <a:graphicData uri="http://schemas.openxmlformats.org/drawingml/2006/picture">
+                <pic:pic xmlns:pic="http://schemas.openxmlformats.org/drawingml/2006/picture">
+                  <pic:nvPicPr>
+                    <pic:cNvPr id="0" name="Picture 9" descr="captura_pantalla_15_04_2026_12_04_44.jpg"/>
+                    <pic:cNvPicPr>
+                      <a:picLocks noChangeAspect="true"/>
+                    </pic:cNvPicPr>
+                  </pic:nvPicPr>
+                  <pic:blipFill>
+                    <a:blip r:embed="rId20"/>
+                    <a:stretch>
+                      <a:fillRect/>
+                    </a:stretch>
+                  </pic:blipFill>
+                  <pic:spPr>
+                    <a:xfrm>
+                      <a:off x="0" y="0"/>
+                      <a:ext cx="1701800" cy="3175000"/>
+                    </a:xfrm>
+                    <a:prstGeom prst="rect">
+                      <a:avLst/>
+                    </a:prstGeom>
+                  </pic:spPr>
+                </pic:pic>
+              </a:graphicData>
+            </a:graphic>
+          </wp:inline>
+        </w:drawing>
+      </w:r>
+      <w:r>
+        <w:drawing>
+          <wp:inline distT="0" distR="0" distB="0" distL="0">
+            <wp:extent cx="1701800" cy="3175000"/>
+            <wp:docPr id="10" name="Drawing 10" descr="captura_pantalla_15_04_2026_12_04_48.jpg"/>
+            <a:graphic xmlns:a="http://schemas.openxmlformats.org/drawingml/2006/main">
+              <a:graphicData uri="http://schemas.openxmlformats.org/drawingml/2006/picture">
+                <pic:pic xmlns:pic="http://schemas.openxmlformats.org/drawingml/2006/picture">
+                  <pic:nvPicPr>
+                    <pic:cNvPr id="0" name="Picture 10" descr="captura_pantalla_15_04_2026_12_04_48.jpg"/>
+                    <pic:cNvPicPr>
+                      <a:picLocks noChangeAspect="true"/>
+                    </pic:cNvPicPr>
+                  </pic:nvPicPr>
+                  <pic:blipFill>
+                    <a:blip r:embed="rId21"/>
+                    <a:stretch>
+                      <a:fillRect/>
+                    </a:stretch>
+                  </pic:blipFill>
+                  <pic:spPr>
+                    <a:xfrm>
+                      <a:off x="0" y="0"/>
+                      <a:ext cx="1701800" cy="3175000"/>
+                    </a:xfrm>
+                    <a:prstGeom prst="rect">
+                      <a:avLst/>
+                    </a:prstGeom>
+                  </pic:spPr>
+                </pic:pic>
+              </a:graphicData>
+            </a:graphic>
+          </wp:inline>
+        </w:drawing>
+      </w:r>
+      <w:r>
+        <w:drawing>
+          <wp:inline distT="0" distR="0" distB="0" distL="0">
+            <wp:extent cx="1701800" cy="3175000"/>
+            <wp:docPr id="11" name="Drawing 11" descr="captura_pantalla_15_04_2026_12_05_03.jpg"/>
+            <a:graphic xmlns:a="http://schemas.openxmlformats.org/drawingml/2006/main">
+              <a:graphicData uri="http://schemas.openxmlformats.org/drawingml/2006/picture">
+                <pic:pic xmlns:pic="http://schemas.openxmlformats.org/drawingml/2006/picture">
+                  <pic:nvPicPr>
+                    <pic:cNvPr id="0" name="Picture 11" descr="captura_pantalla_15_04_2026_12_05_03.jpg"/>
+                    <pic:cNvPicPr>
+                      <a:picLocks noChangeAspect="true"/>
+                    </pic:cNvPicPr>
+                  </pic:nvPicPr>
+                  <pic:blipFill>
+                    <a:blip r:embed="rId22"/>
+                    <a:stretch>
+                      <a:fillRect/>
+                    </a:stretch>
+                  </pic:blipFill>
+                  <pic:spPr>
+                    <a:xfrm>
+                      <a:off x="0" y="0"/>
+                      <a:ext cx="1701800" cy="3175000"/>
+                    </a:xfrm>
+                    <a:prstGeom prst="rect">
+                      <a:avLst/>
+                    </a:prstGeom>
+                  </pic:spPr>
+                </pic:pic>
+              </a:graphicData>
+            </a:graphic>
+          </wp:inline>
+        </w:drawing>
+      </w:r>
+      <w:r>
+        <w:drawing>
+          <wp:inline distT="0" distR="0" distB="0" distL="0">
+            <wp:extent cx="1701800" cy="3175000"/>
+            <wp:docPr id="12" name="Drawing 12" descr="captura_pantalla_15_04_2026_12_05_22.jpg"/>
+            <a:graphic xmlns:a="http://schemas.openxmlformats.org/drawingml/2006/main">
+              <a:graphicData uri="http://schemas.openxmlformats.org/drawingml/2006/picture">
+                <pic:pic xmlns:pic="http://schemas.openxmlformats.org/drawingml/2006/picture">
+                  <pic:nvPicPr>
+                    <pic:cNvPr id="0" name="Picture 12" descr="captura_pantalla_15_04_2026_12_05_22.jpg"/>
+                    <pic:cNvPicPr>
+                      <a:picLocks noChangeAspect="true"/>
+                    </pic:cNvPicPr>
+                  </pic:nvPicPr>
+                  <pic:blipFill>
+                    <a:blip r:embed="rId23"/>
+                    <a:stretch>
+                      <a:fillRect/>
+                    </a:stretch>
+                  </pic:blipFill>
+                  <pic:spPr>
+                    <a:xfrm>
+                      <a:off x="0" y="0"/>
+                      <a:ext cx="1701800" cy="3175000"/>
+                    </a:xfrm>
+                    <a:prstGeom prst="rect">
+                      <a:avLst/>
+                    </a:prstGeom>
+                  </pic:spPr>
+                </pic:pic>
+              </a:graphicData>
+            </a:graphic>
+          </wp:inline>
+        </w:drawing>
+      </w:r>
+      <w:r>
+        <w:drawing>
+          <wp:inline distT="0" distR="0" distB="0" distL="0">
+            <wp:extent cx="1701800" cy="3175000"/>
+            <wp:docPr id="13" name="Drawing 13" descr="captura_pantalla_15_04_2026_12_05_29.jpg"/>
+            <a:graphic xmlns:a="http://schemas.openxmlformats.org/drawingml/2006/main">
+              <a:graphicData uri="http://schemas.openxmlformats.org/drawingml/2006/picture">
+                <pic:pic xmlns:pic="http://schemas.openxmlformats.org/drawingml/2006/picture">
+                  <pic:nvPicPr>
+                    <pic:cNvPr id="0" name="Picture 13" descr="captura_pantalla_15_04_2026_12_05_29.jpg"/>
+                    <pic:cNvPicPr>
+                      <a:picLocks noChangeAspect="true"/>
+                    </pic:cNvPicPr>
+                  </pic:nvPicPr>
+                  <pic:blipFill>
+                    <a:blip r:embed="rId24"/>
+                    <a:stretch>
+                      <a:fillRect/>
+                    </a:stretch>
+                  </pic:blipFill>
+                  <pic:spPr>
+                    <a:xfrm>
+                      <a:off x="0" y="0"/>
+                      <a:ext cx="1701800" cy="3175000"/>
+                    </a:xfrm>
+                    <a:prstGeom prst="rect">
+                      <a:avLst/>
+                    </a:prstGeom>
+                  </pic:spPr>
+                </pic:pic>
+              </a:graphicData>
+            </a:graphic>
+          </wp:inline>
+        </w:drawing>
+      </w:r>
+      <w:r>
+        <w:drawing>
+          <wp:inline distT="0" distR="0" distB="0" distL="0">
+            <wp:extent cx="1701800" cy="3175000"/>
+            <wp:docPr id="14" name="Drawing 14" descr="captura_pantalla_15_04_2026_12_05_47.jpg"/>
+            <a:graphic xmlns:a="http://schemas.openxmlformats.org/drawingml/2006/main">
+              <a:graphicData uri="http://schemas.openxmlformats.org/drawingml/2006/picture">
+                <pic:pic xmlns:pic="http://schemas.openxmlformats.org/drawingml/2006/picture">
+                  <pic:nvPicPr>
+                    <pic:cNvPr id="0" name="Picture 14" descr="captura_pantalla_15_04_2026_12_05_47.jpg"/>
+                    <pic:cNvPicPr>
+                      <a:picLocks noChangeAspect="true"/>
+                    </pic:cNvPicPr>
+                  </pic:nvPicPr>
+                  <pic:blipFill>
+                    <a:blip r:embed="rId25"/>
+                    <a:stretch>
+                      <a:fillRect/>
+                    </a:stretch>
+                  </pic:blipFill>
+                  <pic:spPr>
+                    <a:xfrm>
+                      <a:off x="0" y="0"/>
+                      <a:ext cx="1701800" cy="3175000"/>
+                    </a:xfrm>
+                    <a:prstGeom prst="rect">
+                      <a:avLst/>
+                    </a:prstGeom>
+                  </pic:spPr>
+                </pic:pic>
+              </a:graphicData>
+            </a:graphic>
+          </wp:inline>
+        </w:drawing>
+      </w:r>
+      <w:r>
+        <w:drawing>
+          <wp:inline distT="0" distR="0" distB="0" distL="0">
+            <wp:extent cx="1701800" cy="3175000"/>
+            <wp:docPr id="15" name="Drawing 15" descr="captura_pantalla_15_04_2026_12_06_16.jpg"/>
+            <a:graphic xmlns:a="http://schemas.openxmlformats.org/drawingml/2006/main">
+              <a:graphicData uri="http://schemas.openxmlformats.org/drawingml/2006/picture">
+                <pic:pic xmlns:pic="http://schemas.openxmlformats.org/drawingml/2006/picture">
+                  <pic:nvPicPr>
+                    <pic:cNvPr id="0" name="Picture 15" descr="captura_pantalla_15_04_2026_12_06_16.jpg"/>
+                    <pic:cNvPicPr>
+                      <a:picLocks noChangeAspect="true"/>
+                    </pic:cNvPicPr>
+                  </pic:nvPicPr>
+                  <pic:blipFill>
+                    <a:blip r:embed="rId26"/>
+                    <a:stretch>
+                      <a:fillRect/>
+                    </a:stretch>
+                  </pic:blipFill>
+                  <pic:spPr>
+                    <a:xfrm>
+                      <a:off x="0" y="0"/>
+                      <a:ext cx="1701800" cy="3175000"/>
+                    </a:xfrm>
+                    <a:prstGeom prst="rect">
+                      <a:avLst/>
+                    </a:prstGeom>
+                  </pic:spPr>
+                </pic:pic>
+              </a:graphicData>
+            </a:graphic>
+          </wp:inline>
+        </w:drawing>
+      </w:r>
+      <w:r>
+        <w:drawing>
+          <wp:inline distT="0" distR="0" distB="0" distL="0">
+            <wp:extent cx="1701800" cy="3175000"/>
+            <wp:docPr id="16" name="Drawing 16" descr="captura_pantalla_15_04_2026_12_06_32.jpg"/>
+            <a:graphic xmlns:a="http://schemas.openxmlformats.org/drawingml/2006/main">
+              <a:graphicData uri="http://schemas.openxmlformats.org/drawingml/2006/picture">
+                <pic:pic xmlns:pic="http://schemas.openxmlformats.org/drawingml/2006/picture">
+                  <pic:nvPicPr>
+                    <pic:cNvPr id="0" name="Picture 16" descr="captura_pantalla_15_04_2026_12_06_32.jpg"/>
+                    <pic:cNvPicPr>
+                      <a:picLocks noChangeAspect="true"/>
+                    </pic:cNvPicPr>
+                  </pic:nvPicPr>
+                  <pic:blipFill>
+                    <a:blip r:embed="rId27"/>
+                    <a:stretch>
+                      <a:fillRect/>
+                    </a:stretch>
+                  </pic:blipFill>
+                  <pic:spPr>
+                    <a:xfrm>
+                      <a:off x="0" y="0"/>
+                      <a:ext cx="1701800" cy="3175000"/>
+                    </a:xfrm>
+                    <a:prstGeom prst="rect">
+                      <a:avLst/>
+                    </a:prstGeom>
+                  </pic:spPr>
+                </pic:pic>
+              </a:graphicData>
+            </a:graphic>
+          </wp:inline>
+        </w:drawing>
+      </w:r>
+    </w:p>
     <w:sectPr>
       <w:headerReference w:type="default" r:id="rId8"/>
       <w:pgSz w:w="12240" w:h="15840"/>

</xml_diff>

<commit_message>
Actualización nuevos paquetes Win
</commit_message>
<xml_diff>
--- a/ruta/EXXO.docx
+++ b/ruta/EXXO.docx
@@ -198,603 +198,6 @@
     </w:tbl>
     <w:p/>
     <w:p/>
-    <w:p>
-      <w:r>
-        <w:drawing>
-          <wp:inline distT="0" distR="0" distB="0" distL="0">
-            <wp:extent cx="1701800" cy="3175000"/>
-            <wp:docPr id="0" name="Drawing 0" descr="captura_pantalla_15_04_2026_12_01_57.jpg"/>
-            <a:graphic xmlns:a="http://schemas.openxmlformats.org/drawingml/2006/main">
-              <a:graphicData uri="http://schemas.openxmlformats.org/drawingml/2006/picture">
-                <pic:pic xmlns:pic="http://schemas.openxmlformats.org/drawingml/2006/picture">
-                  <pic:nvPicPr>
-                    <pic:cNvPr id="0" name="Picture 0" descr="captura_pantalla_15_04_2026_12_01_57.jpg"/>
-                    <pic:cNvPicPr>
-                      <a:picLocks noChangeAspect="true"/>
-                    </pic:cNvPicPr>
-                  </pic:nvPicPr>
-                  <pic:blipFill>
-                    <a:blip r:embed="rId11"/>
-                    <a:stretch>
-                      <a:fillRect/>
-                    </a:stretch>
-                  </pic:blipFill>
-                  <pic:spPr>
-                    <a:xfrm>
-                      <a:off x="0" y="0"/>
-                      <a:ext cx="1701800" cy="3175000"/>
-                    </a:xfrm>
-                    <a:prstGeom prst="rect">
-                      <a:avLst/>
-                    </a:prstGeom>
-                  </pic:spPr>
-                </pic:pic>
-              </a:graphicData>
-            </a:graphic>
-          </wp:inline>
-        </w:drawing>
-      </w:r>
-      <w:r>
-        <w:drawing>
-          <wp:inline distT="0" distR="0" distB="0" distL="0">
-            <wp:extent cx="1701800" cy="3175000"/>
-            <wp:docPr id="1" name="Drawing 1" descr="captura_pantalla_15_04_2026_12_02_26.jpg"/>
-            <a:graphic xmlns:a="http://schemas.openxmlformats.org/drawingml/2006/main">
-              <a:graphicData uri="http://schemas.openxmlformats.org/drawingml/2006/picture">
-                <pic:pic xmlns:pic="http://schemas.openxmlformats.org/drawingml/2006/picture">
-                  <pic:nvPicPr>
-                    <pic:cNvPr id="0" name="Picture 1" descr="captura_pantalla_15_04_2026_12_02_26.jpg"/>
-                    <pic:cNvPicPr>
-                      <a:picLocks noChangeAspect="true"/>
-                    </pic:cNvPicPr>
-                  </pic:nvPicPr>
-                  <pic:blipFill>
-                    <a:blip r:embed="rId12"/>
-                    <a:stretch>
-                      <a:fillRect/>
-                    </a:stretch>
-                  </pic:blipFill>
-                  <pic:spPr>
-                    <a:xfrm>
-                      <a:off x="0" y="0"/>
-                      <a:ext cx="1701800" cy="3175000"/>
-                    </a:xfrm>
-                    <a:prstGeom prst="rect">
-                      <a:avLst/>
-                    </a:prstGeom>
-                  </pic:spPr>
-                </pic:pic>
-              </a:graphicData>
-            </a:graphic>
-          </wp:inline>
-        </w:drawing>
-      </w:r>
-      <w:r>
-        <w:drawing>
-          <wp:inline distT="0" distR="0" distB="0" distL="0">
-            <wp:extent cx="1701800" cy="3175000"/>
-            <wp:docPr id="2" name="Drawing 2" descr="captura_pantalla_15_04_2026_12_02_29.jpg"/>
-            <a:graphic xmlns:a="http://schemas.openxmlformats.org/drawingml/2006/main">
-              <a:graphicData uri="http://schemas.openxmlformats.org/drawingml/2006/picture">
-                <pic:pic xmlns:pic="http://schemas.openxmlformats.org/drawingml/2006/picture">
-                  <pic:nvPicPr>
-                    <pic:cNvPr id="0" name="Picture 2" descr="captura_pantalla_15_04_2026_12_02_29.jpg"/>
-                    <pic:cNvPicPr>
-                      <a:picLocks noChangeAspect="true"/>
-                    </pic:cNvPicPr>
-                  </pic:nvPicPr>
-                  <pic:blipFill>
-                    <a:blip r:embed="rId13"/>
-                    <a:stretch>
-                      <a:fillRect/>
-                    </a:stretch>
-                  </pic:blipFill>
-                  <pic:spPr>
-                    <a:xfrm>
-                      <a:off x="0" y="0"/>
-                      <a:ext cx="1701800" cy="3175000"/>
-                    </a:xfrm>
-                    <a:prstGeom prst="rect">
-                      <a:avLst/>
-                    </a:prstGeom>
-                  </pic:spPr>
-                </pic:pic>
-              </a:graphicData>
-            </a:graphic>
-          </wp:inline>
-        </w:drawing>
-      </w:r>
-      <w:r>
-        <w:drawing>
-          <wp:inline distT="0" distR="0" distB="0" distL="0">
-            <wp:extent cx="1701800" cy="3175000"/>
-            <wp:docPr id="3" name="Drawing 3" descr="captura_pantalla_15_04_2026_12_02_53.jpg"/>
-            <a:graphic xmlns:a="http://schemas.openxmlformats.org/drawingml/2006/main">
-              <a:graphicData uri="http://schemas.openxmlformats.org/drawingml/2006/picture">
-                <pic:pic xmlns:pic="http://schemas.openxmlformats.org/drawingml/2006/picture">
-                  <pic:nvPicPr>
-                    <pic:cNvPr id="0" name="Picture 3" descr="captura_pantalla_15_04_2026_12_02_53.jpg"/>
-                    <pic:cNvPicPr>
-                      <a:picLocks noChangeAspect="true"/>
-                    </pic:cNvPicPr>
-                  </pic:nvPicPr>
-                  <pic:blipFill>
-                    <a:blip r:embed="rId14"/>
-                    <a:stretch>
-                      <a:fillRect/>
-                    </a:stretch>
-                  </pic:blipFill>
-                  <pic:spPr>
-                    <a:xfrm>
-                      <a:off x="0" y="0"/>
-                      <a:ext cx="1701800" cy="3175000"/>
-                    </a:xfrm>
-                    <a:prstGeom prst="rect">
-                      <a:avLst/>
-                    </a:prstGeom>
-                  </pic:spPr>
-                </pic:pic>
-              </a:graphicData>
-            </a:graphic>
-          </wp:inline>
-        </w:drawing>
-      </w:r>
-      <w:r>
-        <w:drawing>
-          <wp:inline distT="0" distR="0" distB="0" distL="0">
-            <wp:extent cx="1701800" cy="3175000"/>
-            <wp:docPr id="4" name="Drawing 4" descr="captura_pantalla_15_04_2026_12_03_12.jpg"/>
-            <a:graphic xmlns:a="http://schemas.openxmlformats.org/drawingml/2006/main">
-              <a:graphicData uri="http://schemas.openxmlformats.org/drawingml/2006/picture">
-                <pic:pic xmlns:pic="http://schemas.openxmlformats.org/drawingml/2006/picture">
-                  <pic:nvPicPr>
-                    <pic:cNvPr id="0" name="Picture 4" descr="captura_pantalla_15_04_2026_12_03_12.jpg"/>
-                    <pic:cNvPicPr>
-                      <a:picLocks noChangeAspect="true"/>
-                    </pic:cNvPicPr>
-                  </pic:nvPicPr>
-                  <pic:blipFill>
-                    <a:blip r:embed="rId15"/>
-                    <a:stretch>
-                      <a:fillRect/>
-                    </a:stretch>
-                  </pic:blipFill>
-                  <pic:spPr>
-                    <a:xfrm>
-                      <a:off x="0" y="0"/>
-                      <a:ext cx="1701800" cy="3175000"/>
-                    </a:xfrm>
-                    <a:prstGeom prst="rect">
-                      <a:avLst/>
-                    </a:prstGeom>
-                  </pic:spPr>
-                </pic:pic>
-              </a:graphicData>
-            </a:graphic>
-          </wp:inline>
-        </w:drawing>
-      </w:r>
-      <w:r>
-        <w:drawing>
-          <wp:inline distT="0" distR="0" distB="0" distL="0">
-            <wp:extent cx="1701800" cy="3175000"/>
-            <wp:docPr id="5" name="Drawing 5" descr="captura_pantalla_15_04_2026_12_03_38.jpg"/>
-            <a:graphic xmlns:a="http://schemas.openxmlformats.org/drawingml/2006/main">
-              <a:graphicData uri="http://schemas.openxmlformats.org/drawingml/2006/picture">
-                <pic:pic xmlns:pic="http://schemas.openxmlformats.org/drawingml/2006/picture">
-                  <pic:nvPicPr>
-                    <pic:cNvPr id="0" name="Picture 5" descr="captura_pantalla_15_04_2026_12_03_38.jpg"/>
-                    <pic:cNvPicPr>
-                      <a:picLocks noChangeAspect="true"/>
-                    </pic:cNvPicPr>
-                  </pic:nvPicPr>
-                  <pic:blipFill>
-                    <a:blip r:embed="rId16"/>
-                    <a:stretch>
-                      <a:fillRect/>
-                    </a:stretch>
-                  </pic:blipFill>
-                  <pic:spPr>
-                    <a:xfrm>
-                      <a:off x="0" y="0"/>
-                      <a:ext cx="1701800" cy="3175000"/>
-                    </a:xfrm>
-                    <a:prstGeom prst="rect">
-                      <a:avLst/>
-                    </a:prstGeom>
-                  </pic:spPr>
-                </pic:pic>
-              </a:graphicData>
-            </a:graphic>
-          </wp:inline>
-        </w:drawing>
-      </w:r>
-      <w:r>
-        <w:drawing>
-          <wp:inline distT="0" distR="0" distB="0" distL="0">
-            <wp:extent cx="1701800" cy="3175000"/>
-            <wp:docPr id="6" name="Drawing 6" descr="captura_pantalla_15_04_2026_12_03_55.jpg"/>
-            <a:graphic xmlns:a="http://schemas.openxmlformats.org/drawingml/2006/main">
-              <a:graphicData uri="http://schemas.openxmlformats.org/drawingml/2006/picture">
-                <pic:pic xmlns:pic="http://schemas.openxmlformats.org/drawingml/2006/picture">
-                  <pic:nvPicPr>
-                    <pic:cNvPr id="0" name="Picture 6" descr="captura_pantalla_15_04_2026_12_03_55.jpg"/>
-                    <pic:cNvPicPr>
-                      <a:picLocks noChangeAspect="true"/>
-                    </pic:cNvPicPr>
-                  </pic:nvPicPr>
-                  <pic:blipFill>
-                    <a:blip r:embed="rId17"/>
-                    <a:stretch>
-                      <a:fillRect/>
-                    </a:stretch>
-                  </pic:blipFill>
-                  <pic:spPr>
-                    <a:xfrm>
-                      <a:off x="0" y="0"/>
-                      <a:ext cx="1701800" cy="3175000"/>
-                    </a:xfrm>
-                    <a:prstGeom prst="rect">
-                      <a:avLst/>
-                    </a:prstGeom>
-                  </pic:spPr>
-                </pic:pic>
-              </a:graphicData>
-            </a:graphic>
-          </wp:inline>
-        </w:drawing>
-      </w:r>
-      <w:r>
-        <w:drawing>
-          <wp:inline distT="0" distR="0" distB="0" distL="0">
-            <wp:extent cx="1701800" cy="3175000"/>
-            <wp:docPr id="7" name="Drawing 7" descr="captura_pantalla_15_04_2026_12_04_19.jpg"/>
-            <a:graphic xmlns:a="http://schemas.openxmlformats.org/drawingml/2006/main">
-              <a:graphicData uri="http://schemas.openxmlformats.org/drawingml/2006/picture">
-                <pic:pic xmlns:pic="http://schemas.openxmlformats.org/drawingml/2006/picture">
-                  <pic:nvPicPr>
-                    <pic:cNvPr id="0" name="Picture 7" descr="captura_pantalla_15_04_2026_12_04_19.jpg"/>
-                    <pic:cNvPicPr>
-                      <a:picLocks noChangeAspect="true"/>
-                    </pic:cNvPicPr>
-                  </pic:nvPicPr>
-                  <pic:blipFill>
-                    <a:blip r:embed="rId18"/>
-                    <a:stretch>
-                      <a:fillRect/>
-                    </a:stretch>
-                  </pic:blipFill>
-                  <pic:spPr>
-                    <a:xfrm>
-                      <a:off x="0" y="0"/>
-                      <a:ext cx="1701800" cy="3175000"/>
-                    </a:xfrm>
-                    <a:prstGeom prst="rect">
-                      <a:avLst/>
-                    </a:prstGeom>
-                  </pic:spPr>
-                </pic:pic>
-              </a:graphicData>
-            </a:graphic>
-          </wp:inline>
-        </w:drawing>
-      </w:r>
-      <w:r>
-        <w:drawing>
-          <wp:inline distT="0" distR="0" distB="0" distL="0">
-            <wp:extent cx="1701800" cy="3175000"/>
-            <wp:docPr id="8" name="Drawing 8" descr="captura_pantalla_15_04_2026_12_04_24.jpg"/>
-            <a:graphic xmlns:a="http://schemas.openxmlformats.org/drawingml/2006/main">
-              <a:graphicData uri="http://schemas.openxmlformats.org/drawingml/2006/picture">
-                <pic:pic xmlns:pic="http://schemas.openxmlformats.org/drawingml/2006/picture">
-                  <pic:nvPicPr>
-                    <pic:cNvPr id="0" name="Picture 8" descr="captura_pantalla_15_04_2026_12_04_24.jpg"/>
-                    <pic:cNvPicPr>
-                      <a:picLocks noChangeAspect="true"/>
-                    </pic:cNvPicPr>
-                  </pic:nvPicPr>
-                  <pic:blipFill>
-                    <a:blip r:embed="rId19"/>
-                    <a:stretch>
-                      <a:fillRect/>
-                    </a:stretch>
-                  </pic:blipFill>
-                  <pic:spPr>
-                    <a:xfrm>
-                      <a:off x="0" y="0"/>
-                      <a:ext cx="1701800" cy="3175000"/>
-                    </a:xfrm>
-                    <a:prstGeom prst="rect">
-                      <a:avLst/>
-                    </a:prstGeom>
-                  </pic:spPr>
-                </pic:pic>
-              </a:graphicData>
-            </a:graphic>
-          </wp:inline>
-        </w:drawing>
-      </w:r>
-      <w:r>
-        <w:drawing>
-          <wp:inline distT="0" distR="0" distB="0" distL="0">
-            <wp:extent cx="1701800" cy="3175000"/>
-            <wp:docPr id="9" name="Drawing 9" descr="captura_pantalla_15_04_2026_12_04_44.jpg"/>
-            <a:graphic xmlns:a="http://schemas.openxmlformats.org/drawingml/2006/main">
-              <a:graphicData uri="http://schemas.openxmlformats.org/drawingml/2006/picture">
-                <pic:pic xmlns:pic="http://schemas.openxmlformats.org/drawingml/2006/picture">
-                  <pic:nvPicPr>
-                    <pic:cNvPr id="0" name="Picture 9" descr="captura_pantalla_15_04_2026_12_04_44.jpg"/>
-                    <pic:cNvPicPr>
-                      <a:picLocks noChangeAspect="true"/>
-                    </pic:cNvPicPr>
-                  </pic:nvPicPr>
-                  <pic:blipFill>
-                    <a:blip r:embed="rId20"/>
-                    <a:stretch>
-                      <a:fillRect/>
-                    </a:stretch>
-                  </pic:blipFill>
-                  <pic:spPr>
-                    <a:xfrm>
-                      <a:off x="0" y="0"/>
-                      <a:ext cx="1701800" cy="3175000"/>
-                    </a:xfrm>
-                    <a:prstGeom prst="rect">
-                      <a:avLst/>
-                    </a:prstGeom>
-                  </pic:spPr>
-                </pic:pic>
-              </a:graphicData>
-            </a:graphic>
-          </wp:inline>
-        </w:drawing>
-      </w:r>
-      <w:r>
-        <w:drawing>
-          <wp:inline distT="0" distR="0" distB="0" distL="0">
-            <wp:extent cx="1701800" cy="3175000"/>
-            <wp:docPr id="10" name="Drawing 10" descr="captura_pantalla_15_04_2026_12_04_48.jpg"/>
-            <a:graphic xmlns:a="http://schemas.openxmlformats.org/drawingml/2006/main">
-              <a:graphicData uri="http://schemas.openxmlformats.org/drawingml/2006/picture">
-                <pic:pic xmlns:pic="http://schemas.openxmlformats.org/drawingml/2006/picture">
-                  <pic:nvPicPr>
-                    <pic:cNvPr id="0" name="Picture 10" descr="captura_pantalla_15_04_2026_12_04_48.jpg"/>
-                    <pic:cNvPicPr>
-                      <a:picLocks noChangeAspect="true"/>
-                    </pic:cNvPicPr>
-                  </pic:nvPicPr>
-                  <pic:blipFill>
-                    <a:blip r:embed="rId21"/>
-                    <a:stretch>
-                      <a:fillRect/>
-                    </a:stretch>
-                  </pic:blipFill>
-                  <pic:spPr>
-                    <a:xfrm>
-                      <a:off x="0" y="0"/>
-                      <a:ext cx="1701800" cy="3175000"/>
-                    </a:xfrm>
-                    <a:prstGeom prst="rect">
-                      <a:avLst/>
-                    </a:prstGeom>
-                  </pic:spPr>
-                </pic:pic>
-              </a:graphicData>
-            </a:graphic>
-          </wp:inline>
-        </w:drawing>
-      </w:r>
-      <w:r>
-        <w:drawing>
-          <wp:inline distT="0" distR="0" distB="0" distL="0">
-            <wp:extent cx="1701800" cy="3175000"/>
-            <wp:docPr id="11" name="Drawing 11" descr="captura_pantalla_15_04_2026_12_05_03.jpg"/>
-            <a:graphic xmlns:a="http://schemas.openxmlformats.org/drawingml/2006/main">
-              <a:graphicData uri="http://schemas.openxmlformats.org/drawingml/2006/picture">
-                <pic:pic xmlns:pic="http://schemas.openxmlformats.org/drawingml/2006/picture">
-                  <pic:nvPicPr>
-                    <pic:cNvPr id="0" name="Picture 11" descr="captura_pantalla_15_04_2026_12_05_03.jpg"/>
-                    <pic:cNvPicPr>
-                      <a:picLocks noChangeAspect="true"/>
-                    </pic:cNvPicPr>
-                  </pic:nvPicPr>
-                  <pic:blipFill>
-                    <a:blip r:embed="rId22"/>
-                    <a:stretch>
-                      <a:fillRect/>
-                    </a:stretch>
-                  </pic:blipFill>
-                  <pic:spPr>
-                    <a:xfrm>
-                      <a:off x="0" y="0"/>
-                      <a:ext cx="1701800" cy="3175000"/>
-                    </a:xfrm>
-                    <a:prstGeom prst="rect">
-                      <a:avLst/>
-                    </a:prstGeom>
-                  </pic:spPr>
-                </pic:pic>
-              </a:graphicData>
-            </a:graphic>
-          </wp:inline>
-        </w:drawing>
-      </w:r>
-      <w:r>
-        <w:drawing>
-          <wp:inline distT="0" distR="0" distB="0" distL="0">
-            <wp:extent cx="1701800" cy="3175000"/>
-            <wp:docPr id="12" name="Drawing 12" descr="captura_pantalla_15_04_2026_12_05_22.jpg"/>
-            <a:graphic xmlns:a="http://schemas.openxmlformats.org/drawingml/2006/main">
-              <a:graphicData uri="http://schemas.openxmlformats.org/drawingml/2006/picture">
-                <pic:pic xmlns:pic="http://schemas.openxmlformats.org/drawingml/2006/picture">
-                  <pic:nvPicPr>
-                    <pic:cNvPr id="0" name="Picture 12" descr="captura_pantalla_15_04_2026_12_05_22.jpg"/>
-                    <pic:cNvPicPr>
-                      <a:picLocks noChangeAspect="true"/>
-                    </pic:cNvPicPr>
-                  </pic:nvPicPr>
-                  <pic:blipFill>
-                    <a:blip r:embed="rId23"/>
-                    <a:stretch>
-                      <a:fillRect/>
-                    </a:stretch>
-                  </pic:blipFill>
-                  <pic:spPr>
-                    <a:xfrm>
-                      <a:off x="0" y="0"/>
-                      <a:ext cx="1701800" cy="3175000"/>
-                    </a:xfrm>
-                    <a:prstGeom prst="rect">
-                      <a:avLst/>
-                    </a:prstGeom>
-                  </pic:spPr>
-                </pic:pic>
-              </a:graphicData>
-            </a:graphic>
-          </wp:inline>
-        </w:drawing>
-      </w:r>
-      <w:r>
-        <w:drawing>
-          <wp:inline distT="0" distR="0" distB="0" distL="0">
-            <wp:extent cx="1701800" cy="3175000"/>
-            <wp:docPr id="13" name="Drawing 13" descr="captura_pantalla_15_04_2026_12_05_29.jpg"/>
-            <a:graphic xmlns:a="http://schemas.openxmlformats.org/drawingml/2006/main">
-              <a:graphicData uri="http://schemas.openxmlformats.org/drawingml/2006/picture">
-                <pic:pic xmlns:pic="http://schemas.openxmlformats.org/drawingml/2006/picture">
-                  <pic:nvPicPr>
-                    <pic:cNvPr id="0" name="Picture 13" descr="captura_pantalla_15_04_2026_12_05_29.jpg"/>
-                    <pic:cNvPicPr>
-                      <a:picLocks noChangeAspect="true"/>
-                    </pic:cNvPicPr>
-                  </pic:nvPicPr>
-                  <pic:blipFill>
-                    <a:blip r:embed="rId24"/>
-                    <a:stretch>
-                      <a:fillRect/>
-                    </a:stretch>
-                  </pic:blipFill>
-                  <pic:spPr>
-                    <a:xfrm>
-                      <a:off x="0" y="0"/>
-                      <a:ext cx="1701800" cy="3175000"/>
-                    </a:xfrm>
-                    <a:prstGeom prst="rect">
-                      <a:avLst/>
-                    </a:prstGeom>
-                  </pic:spPr>
-                </pic:pic>
-              </a:graphicData>
-            </a:graphic>
-          </wp:inline>
-        </w:drawing>
-      </w:r>
-      <w:r>
-        <w:drawing>
-          <wp:inline distT="0" distR="0" distB="0" distL="0">
-            <wp:extent cx="1701800" cy="3175000"/>
-            <wp:docPr id="14" name="Drawing 14" descr="captura_pantalla_15_04_2026_12_05_47.jpg"/>
-            <a:graphic xmlns:a="http://schemas.openxmlformats.org/drawingml/2006/main">
-              <a:graphicData uri="http://schemas.openxmlformats.org/drawingml/2006/picture">
-                <pic:pic xmlns:pic="http://schemas.openxmlformats.org/drawingml/2006/picture">
-                  <pic:nvPicPr>
-                    <pic:cNvPr id="0" name="Picture 14" descr="captura_pantalla_15_04_2026_12_05_47.jpg"/>
-                    <pic:cNvPicPr>
-                      <a:picLocks noChangeAspect="true"/>
-                    </pic:cNvPicPr>
-                  </pic:nvPicPr>
-                  <pic:blipFill>
-                    <a:blip r:embed="rId25"/>
-                    <a:stretch>
-                      <a:fillRect/>
-                    </a:stretch>
-                  </pic:blipFill>
-                  <pic:spPr>
-                    <a:xfrm>
-                      <a:off x="0" y="0"/>
-                      <a:ext cx="1701800" cy="3175000"/>
-                    </a:xfrm>
-                    <a:prstGeom prst="rect">
-                      <a:avLst/>
-                    </a:prstGeom>
-                  </pic:spPr>
-                </pic:pic>
-              </a:graphicData>
-            </a:graphic>
-          </wp:inline>
-        </w:drawing>
-      </w:r>
-      <w:r>
-        <w:drawing>
-          <wp:inline distT="0" distR="0" distB="0" distL="0">
-            <wp:extent cx="1701800" cy="3175000"/>
-            <wp:docPr id="15" name="Drawing 15" descr="captura_pantalla_15_04_2026_12_06_16.jpg"/>
-            <a:graphic xmlns:a="http://schemas.openxmlformats.org/drawingml/2006/main">
-              <a:graphicData uri="http://schemas.openxmlformats.org/drawingml/2006/picture">
-                <pic:pic xmlns:pic="http://schemas.openxmlformats.org/drawingml/2006/picture">
-                  <pic:nvPicPr>
-                    <pic:cNvPr id="0" name="Picture 15" descr="captura_pantalla_15_04_2026_12_06_16.jpg"/>
-                    <pic:cNvPicPr>
-                      <a:picLocks noChangeAspect="true"/>
-                    </pic:cNvPicPr>
-                  </pic:nvPicPr>
-                  <pic:blipFill>
-                    <a:blip r:embed="rId26"/>
-                    <a:stretch>
-                      <a:fillRect/>
-                    </a:stretch>
-                  </pic:blipFill>
-                  <pic:spPr>
-                    <a:xfrm>
-                      <a:off x="0" y="0"/>
-                      <a:ext cx="1701800" cy="3175000"/>
-                    </a:xfrm>
-                    <a:prstGeom prst="rect">
-                      <a:avLst/>
-                    </a:prstGeom>
-                  </pic:spPr>
-                </pic:pic>
-              </a:graphicData>
-            </a:graphic>
-          </wp:inline>
-        </w:drawing>
-      </w:r>
-      <w:r>
-        <w:drawing>
-          <wp:inline distT="0" distR="0" distB="0" distL="0">
-            <wp:extent cx="1701800" cy="3175000"/>
-            <wp:docPr id="16" name="Drawing 16" descr="captura_pantalla_15_04_2026_12_06_32.jpg"/>
-            <a:graphic xmlns:a="http://schemas.openxmlformats.org/drawingml/2006/main">
-              <a:graphicData uri="http://schemas.openxmlformats.org/drawingml/2006/picture">
-                <pic:pic xmlns:pic="http://schemas.openxmlformats.org/drawingml/2006/picture">
-                  <pic:nvPicPr>
-                    <pic:cNvPr id="0" name="Picture 16" descr="captura_pantalla_15_04_2026_12_06_32.jpg"/>
-                    <pic:cNvPicPr>
-                      <a:picLocks noChangeAspect="true"/>
-                    </pic:cNvPicPr>
-                  </pic:nvPicPr>
-                  <pic:blipFill>
-                    <a:blip r:embed="rId27"/>
-                    <a:stretch>
-                      <a:fillRect/>
-                    </a:stretch>
-                  </pic:blipFill>
-                  <pic:spPr>
-                    <a:xfrm>
-                      <a:off x="0" y="0"/>
-                      <a:ext cx="1701800" cy="3175000"/>
-                    </a:xfrm>
-                    <a:prstGeom prst="rect">
-                      <a:avLst/>
-                    </a:prstGeom>
-                  </pic:spPr>
-                </pic:pic>
-              </a:graphicData>
-            </a:graphic>
-          </wp:inline>
-        </w:drawing>
-      </w:r>
-    </w:p>
     <w:sectPr>
       <w:headerReference w:type="default" r:id="rId8"/>
       <w:pgSz w:w="12240" w:h="15840"/>

</xml_diff>